<commit_message>
Deploying to gh-pages from @ Morrison-Lab/ids@e681f8c46171670550dd6d978274ffa95436f586 🚀
</commit_message>
<xml_diff>
--- a/index.docx
+++ b/index.docx
@@ -7,7 +7,7 @@
         <w:pStyle w:val="Title"/>
       </w:pPr>
       <w:r>
-        <w:t xml:space="preserve">Quarto Website Template</w:t>
+        <w:t xml:space="preserve">Information Theory for Data Science</w:t>
       </w:r>
     </w:p>
     <w:p>
@@ -15,13 +15,13 @@
         <w:pStyle w:val="Date"/>
       </w:pPr>
       <w:r>
-        <w:t xml:space="preserve">Last modified: 2026-10-12 00:41:55 (PDT)</w:t>
+        <w:t xml:space="preserve">Last modified: 2026-10-12 01:05:26 (PDT)</w:t>
       </w:r>
     </w:p>
-    <w:bookmarkStart w:id="17" w:name="welcome"/>
+    <w:bookmarkStart w:id="11" w:name="welcome"/>
     <w:p>
       <w:pPr>
-        <w:pStyle w:val="Heading1"/>
+        <w:pStyle w:val="Heading2"/>
       </w:pPr>
       <w:r>
         <w:t xml:space="preserve">Welcome</w:t>
@@ -32,7 +32,43 @@
         <w:pStyle w:val="FirstParagraph"/>
       </w:pPr>
       <w:r>
-        <w:t xml:space="preserve">This is a Quarto website template that you can use to create your own website.</w:t>
+        <w:t xml:space="preserve">Information theory measures uncertainty and information:</w:t>
+      </w:r>
+      <w:r>
+        <w:t xml:space="preserve"> </w:t>
+      </w:r>
+      <w:r>
+        <w:t xml:space="preserve">how many bits a message needs, how much one random variable</w:t>
+      </w:r>
+      <w:r>
+        <w:t xml:space="preserve"> </w:t>
+      </w:r>
+      <w:r>
+        <w:t xml:space="preserve">tells us about another, and how fast data can cross a noisy channel.</w:t>
+      </w:r>
+      <w:r>
+        <w:t xml:space="preserve"> </w:t>
+      </w:r>
+      <w:r>
+        <w:t xml:space="preserve">Data science uses its quantities directly:</w:t>
+      </w:r>
+      <w:r>
+        <w:t xml:space="preserve"> </w:t>
+      </w:r>
+      <w:r>
+        <w:t xml:space="preserve">cross-entropy is the loss in logistic regression and neural networks,</w:t>
+      </w:r>
+      <w:r>
+        <w:t xml:space="preserve"> </w:t>
+      </w:r>
+      <w:r>
+        <w:t xml:space="preserve">Kullback–Leibler divergence links maximum likelihood to model fit,</w:t>
+      </w:r>
+      <w:r>
+        <w:t xml:space="preserve"> </w:t>
+      </w:r>
+      <w:r>
+        <w:t xml:space="preserve">and mutual information drives the information gain of decision trees.</w:t>
       </w:r>
     </w:p>
     <w:p>
@@ -40,7 +76,19 @@
         <w:pStyle w:val="BodyText"/>
       </w:pPr>
       <w:r>
-        <w:t xml:space="preserve">The notes are available in multiple formats:</w:t>
+        <w:t xml:space="preserve">These notes collect the information theory that data science courses use.</w:t>
+      </w:r>
+      <w:r>
+        <w:t xml:space="preserve"> </w:t>
+      </w:r>
+      <w:r>
+        <w:t xml:space="preserve">They are new, and the topic pages are still to be written.</w:t>
+      </w:r>
+      <w:r>
+        <w:t xml:space="preserve"> </w:t>
+      </w:r>
+      <w:r>
+        <w:t xml:space="preserve">The planned topics are:</w:t>
       </w:r>
     </w:p>
     <w:p>
@@ -52,14 +100,7 @@
         </w:numPr>
       </w:pPr>
       <w:r>
-        <w:rPr>
-          <w:b/>
-          <w:bCs/>
-        </w:rPr>
-        <w:t xml:space="preserve">HTML Website</w:t>
-      </w:r>
-      <w:r>
-        <w:t xml:space="preserve">: Navigate using the navbar for easy access to all pages</w:t>
+        <w:t xml:space="preserve">entropy, joint and conditional entropy, and mutual information</w:t>
       </w:r>
     </w:p>
     <w:p>
@@ -71,29 +112,7 @@
         </w:numPr>
       </w:pPr>
       <w:r>
-        <w:rPr>
-          <w:b/>
-          <w:bCs/>
-        </w:rPr>
-        <w:t xml:space="preserve">RevealJS Slides</w:t>
-      </w:r>
-      <w:r>
-        <w:t xml:space="preserve">: Each chapter can generate a presentation format with</w:t>
-      </w:r>
-      <w:r>
-        <w:t xml:space="preserve"> </w:t>
-      </w:r>
-      <w:r>
-        <w:rPr>
-          <w:rStyle w:val="VerbatimChar"/>
-        </w:rPr>
-        <w:t xml:space="preserve">-slides.html</w:t>
-      </w:r>
-      <w:r>
-        <w:t xml:space="preserve"> </w:t>
-      </w:r>
-      <w:r>
-        <w:t xml:space="preserve">suffix</w:t>
+        <w:t xml:space="preserve">Kullback–Leibler divergence and its link to maximum likelihood</w:t>
       </w:r>
     </w:p>
     <w:p>
@@ -105,29 +124,7 @@
         </w:numPr>
       </w:pPr>
       <w:r>
-        <w:rPr>
-          <w:b/>
-          <w:bCs/>
-        </w:rPr>
-        <w:t xml:space="preserve">PDF Handouts</w:t>
-      </w:r>
-      <w:r>
-        <w:t xml:space="preserve">: Each chapter can generate a PDF handout with</w:t>
-      </w:r>
-      <w:r>
-        <w:t xml:space="preserve"> </w:t>
-      </w:r>
-      <w:r>
-        <w:rPr>
-          <w:rStyle w:val="VerbatimChar"/>
-        </w:rPr>
-        <w:t xml:space="preserve">-handout.pdf</w:t>
-      </w:r>
-      <w:r>
-        <w:t xml:space="preserve"> </w:t>
-      </w:r>
-      <w:r>
-        <w:t xml:space="preserve">suffix</w:t>
+        <w:t xml:space="preserve">source coding: the source coding theorem, Huffman and arithmetic codes</w:t>
       </w:r>
     </w:p>
     <w:p>
@@ -139,46 +136,27 @@
         </w:numPr>
       </w:pPr>
       <w:r>
-        <w:rPr>
-          <w:b/>
-          <w:bCs/>
-        </w:rPr>
-        <w:t xml:space="preserve">DOCX Documents</w:t>
-      </w:r>
-      <w:r>
-        <w:t xml:space="preserve">: Each chapter can generate a Microsoft Word document with</w:t>
-      </w:r>
-      <w:r>
-        <w:t xml:space="preserve"> </w:t>
-      </w:r>
-      <w:r>
-        <w:rPr>
-          <w:rStyle w:val="VerbatimChar"/>
-        </w:rPr>
-        <w:t xml:space="preserve">.docx</w:t>
-      </w:r>
-      <w:r>
-        <w:t xml:space="preserve"> </w:t>
-      </w:r>
-      <w:r>
-        <w:t xml:space="preserve">extension</w:t>
-      </w:r>
-    </w:p>
-    <w:bookmarkStart w:id="10" w:name="about-this-website"/>
-    <w:p>
-      <w:pPr>
-        <w:pStyle w:val="Heading2"/>
-      </w:pPr>
-      <w:r>
-        <w:t xml:space="preserve">0.1 About this website</w:t>
+        <w:t xml:space="preserve">channel coding: channel capacity and the noisy-channel coding theorem</w:t>
       </w:r>
     </w:p>
     <w:p>
       <w:pPr>
+        <w:pStyle w:val="Compact"/>
+        <w:numPr>
+          <w:ilvl w:val="0"/>
+          <w:numId w:val="1001"/>
+        </w:numPr>
+      </w:pPr>
+      <w:r>
+        <w:t xml:space="preserve">Kolmogorov complexity, and how it relates to Shannon entropy</w:t>
+      </w:r>
+    </w:p>
+    <w:p>
+      <w:pPr>
         <w:pStyle w:val="FirstParagraph"/>
       </w:pPr>
       <w:r>
-        <w:t xml:space="preserve">This website is built with</w:t>
+        <w:t xml:space="preserve">Entropy, cross-entropy and KL divergence are defined in</w:t>
       </w:r>
       <w:r>
         <w:t xml:space="preserve"> </w:t>
@@ -187,22 +165,52 @@
         <w:r>
           <w:rPr>
             <w:rStyle w:val="Hyperlink"/>
+            <w:i/>
+            <w:iCs/>
           </w:rPr>
-          <w:t xml:space="preserve">Quarto</w:t>
+          <w:t xml:space="preserve">Probability for Data Science</w:t>
         </w:r>
       </w:hyperlink>
       <w:r>
-        <w:t xml:space="preserve">, an open-source scientific and technical publishing system. You can use Quarto to create books, websites, blogs, presentations, and more from markdown files.</w:t>
+        <w:t xml:space="preserve">;</w:t>
+      </w:r>
+      <w:r>
+        <w:t xml:space="preserve"> </w:t>
+      </w:r>
+      <w:r>
+        <w:t xml:space="preserve">pages here link to those definitions rather than repeating them.</w:t>
+      </w:r>
+      <w:r>
+        <w:t xml:space="preserve"> </w:t>
+      </w:r>
+      <w:r>
+        <w:t xml:space="preserve">Computational complexity has its own library,</w:t>
+      </w:r>
+      <w:r>
+        <w:t xml:space="preserve"> </w:t>
+      </w:r>
+      <w:hyperlink r:id="rId10">
+        <w:r>
+          <w:rPr>
+            <w:rStyle w:val="Hyperlink"/>
+            <w:i/>
+            <w:iCs/>
+          </w:rPr>
+          <w:t xml:space="preserve">Computational Complexity for Data Science</w:t>
+        </w:r>
+      </w:hyperlink>
+      <w:r>
+        <w:t xml:space="preserve">.</w:t>
       </w:r>
     </w:p>
-    <w:bookmarkEnd w:id="10"/>
-    <w:bookmarkStart w:id="11" w:name="getting-started"/>
+    <w:bookmarkEnd w:id="11"/>
+    <w:bookmarkStart w:id="12" w:name="using-these-notes-in-another-site"/>
     <w:p>
       <w:pPr>
         <w:pStyle w:val="Heading2"/>
       </w:pPr>
       <w:r>
-        <w:t xml:space="preserve">0.2 Getting Started</w:t>
+        <w:t xml:space="preserve">Using these notes in another site</w:t>
       </w:r>
     </w:p>
     <w:p>
@@ -210,25 +218,19 @@
         <w:pStyle w:val="FirstParagraph"/>
       </w:pPr>
       <w:r>
-        <w:t xml:space="preserve">To use this template:</w:t>
-      </w:r>
-    </w:p>
-    <w:p>
-      <w:pPr>
-        <w:numPr>
-          <w:ilvl w:val="0"/>
-          <w:numId w:val="1002"/>
-        </w:numPr>
-      </w:pPr>
-      <w:r>
-        <w:rPr>
-          <w:b/>
-          <w:bCs/>
-        </w:rPr>
-        <w:t xml:space="preserve">Update the configuration</w:t>
-      </w:r>
-      <w:r>
-        <w:t xml:space="preserve">: Edit</w:t>
+        <w:t xml:space="preserve">Course sites link to these pages by URL;</w:t>
+      </w:r>
+      <w:r>
+        <w:t xml:space="preserve"> </w:t>
+      </w:r>
+      <w:r>
+        <w:t xml:space="preserve">they do not include this repository as a git submodule.</w:t>
+      </w:r>
+      <w:r>
+        <w:t xml:space="preserve"> </w:t>
+      </w:r>
+      <w:r>
+        <w:t xml:space="preserve">A host site that keeps a copy of this repository at its root, named</w:t>
       </w:r>
       <w:r>
         <w:t xml:space="preserve"> </w:t>
@@ -237,31 +239,16 @@
         <w:rPr>
           <w:rStyle w:val="VerbatimChar"/>
         </w:rPr>
-        <w:t xml:space="preserve">_quarto-website.yml</w:t>
-      </w:r>
-      <w:r>
-        <w:t xml:space="preserve"> </w:t>
-      </w:r>
-      <w:r>
-        <w:t xml:space="preserve">to change the website title, site URL, and navigation menu.</w:t>
-      </w:r>
-    </w:p>
-    <w:p>
-      <w:pPr>
-        <w:numPr>
-          <w:ilvl w:val="0"/>
-          <w:numId w:val="1002"/>
-        </w:numPr>
-      </w:pPr>
-      <w:r>
-        <w:rPr>
-          <w:b/>
-          <w:bCs/>
-        </w:rPr>
-        <w:t xml:space="preserve">Add your content</w:t>
-      </w:r>
-      <w:r>
-        <w:t xml:space="preserve">: Create new</w:t>
+        <w:t xml:space="preserve">ids</w:t>
+      </w:r>
+      <w:r>
+        <w:t xml:space="preserve">,</w:t>
+      </w:r>
+      <w:r>
+        <w:t xml:space="preserve"> </w:t>
+      </w:r>
+      <w:r>
+        <w:t xml:space="preserve">can still include fragments with paths that start with</w:t>
       </w:r>
       <w:r>
         <w:t xml:space="preserve"> </w:t>
@@ -270,13 +257,22 @@
         <w:rPr>
           <w:rStyle w:val="VerbatimChar"/>
         </w:rPr>
-        <w:t xml:space="preserve">.qmd</w:t>
-      </w:r>
-      <w:r>
-        <w:t xml:space="preserve"> </w:t>
-      </w:r>
-      <w:r>
-        <w:t xml:space="preserve">files for each page and add them to the navigation menu and the sidebar in</w:t>
+        <w:t xml:space="preserve">ids/</w:t>
+      </w:r>
+      <w:r>
+        <w:t xml:space="preserve">.</w:t>
+      </w:r>
+      <w:r>
+        <w:t xml:space="preserve"> </w:t>
+      </w:r>
+      <w:r>
+        <w:t xml:space="preserve">This site includes its own fragments the same way,</w:t>
+      </w:r>
+      <w:r>
+        <w:t xml:space="preserve"> </w:t>
+      </w:r>
+      <w:r>
+        <w:t xml:space="preserve">through a</w:t>
       </w:r>
       <w:r>
         <w:t xml:space="preserve"> </w:t>
@@ -285,31 +281,21 @@
         <w:rPr>
           <w:rStyle w:val="VerbatimChar"/>
         </w:rPr>
-        <w:t xml:space="preserve">_quarto-website.yml</w:t>
-      </w:r>
-      <w:r>
-        <w:t xml:space="preserve"> </w:t>
-      </w:r>
-      <w:r>
-        <w:t xml:space="preserve">(the sidebar order sets the previous/next page links).</w:t>
+        <w:t xml:space="preserve">ids</w:t>
+      </w:r>
+      <w:r>
+        <w:t xml:space="preserve"> </w:t>
+      </w:r>
+      <w:r>
+        <w:t xml:space="preserve">symlink that points at the repository root.</w:t>
       </w:r>
     </w:p>
     <w:p>
       <w:pPr>
-        <w:numPr>
-          <w:ilvl w:val="0"/>
-          <w:numId w:val="1002"/>
-        </w:numPr>
-      </w:pPr>
-      <w:r>
-        <w:rPr>
-          <w:b/>
-          <w:bCs/>
-        </w:rPr>
-        <w:t xml:space="preserve">Customize the style</w:t>
-      </w:r>
-      <w:r>
-        <w:t xml:space="preserve">: Modify</w:t>
+        <w:pStyle w:val="BodyText"/>
+      </w:pPr>
+      <w:r>
+        <w:t xml:space="preserve">Quarto resolves</w:t>
       </w:r>
       <w:r>
         <w:t xml:space="preserve"> </w:t>
@@ -318,293 +304,28 @@
         <w:rPr>
           <w:rStyle w:val="VerbatimChar"/>
         </w:rPr>
-        <w:t xml:space="preserve">styles.css</w:t>
-      </w:r>
-      <w:r>
-        <w:t xml:space="preserve"> </w:t>
-      </w:r>
-      <w:r>
-        <w:t xml:space="preserve">to change the appearance of your website.</w:t>
-      </w:r>
-    </w:p>
-    <w:p>
-      <w:pPr>
-        <w:numPr>
-          <w:ilvl w:val="0"/>
-          <w:numId w:val="1002"/>
-        </w:numPr>
-      </w:pPr>
-      <w:r>
-        <w:rPr>
-          <w:b/>
-          <w:bCs/>
-        </w:rPr>
-        <w:t xml:space="preserve">Add references</w:t>
-      </w:r>
-      <w:r>
-        <w:t xml:space="preserve">: Update</w:t>
-      </w:r>
-      <w:r>
-        <w:t xml:space="preserve"> </w:t>
-      </w:r>
-      <w:r>
-        <w:rPr>
-          <w:rStyle w:val="VerbatimChar"/>
-        </w:rPr>
-        <w:t xml:space="preserve">references.bib</w:t>
-      </w:r>
-      <w:r>
-        <w:t xml:space="preserve"> </w:t>
-      </w:r>
-      <w:r>
-        <w:t xml:space="preserve">with your citations.</w:t>
-      </w:r>
-    </w:p>
-    <w:bookmarkEnd w:id="11"/>
-    <w:bookmarkStart w:id="12" w:name="building-the-website"/>
-    <w:p>
-      <w:pPr>
-        <w:pStyle w:val="Heading2"/>
-      </w:pPr>
-      <w:r>
-        <w:t xml:space="preserve">0.3 Building the website</w:t>
-      </w:r>
-    </w:p>
-    <w:p>
-      <w:pPr>
-        <w:pStyle w:val="FirstParagraph"/>
-      </w:pPr>
-      <w:r>
-        <w:t xml:space="preserve">To render the website locally:</w:t>
-      </w:r>
-    </w:p>
-    <w:p>
-      <w:pPr>
-        <w:pStyle w:val="SourceCode"/>
-      </w:pPr>
-      <w:r>
-        <w:rPr>
-          <w:rStyle w:val="ExtensionTok"/>
-        </w:rPr>
-        <w:t xml:space="preserve">quarto</w:t>
-      </w:r>
-      <w:r>
-        <w:rPr>
-          <w:rStyle w:val="NormalTok"/>
-        </w:rPr>
-        <w:t xml:space="preserve"> render</w:t>
-      </w:r>
-    </w:p>
-    <w:p>
-      <w:pPr>
-        <w:pStyle w:val="FirstParagraph"/>
-      </w:pPr>
-      <w:r>
-        <w:t xml:space="preserve">To preview the website with live reload:</w:t>
-      </w:r>
-    </w:p>
-    <w:p>
-      <w:pPr>
-        <w:pStyle w:val="SourceCode"/>
-      </w:pPr>
-      <w:r>
-        <w:rPr>
-          <w:rStyle w:val="ExtensionTok"/>
-        </w:rPr>
-        <w:t xml:space="preserve">quarto</w:t>
-      </w:r>
-      <w:r>
-        <w:rPr>
-          <w:rStyle w:val="NormalTok"/>
-        </w:rPr>
-        <w:t xml:space="preserve"> preview</w:t>
-      </w:r>
-    </w:p>
-    <w:p>
-      <w:pPr>
-        <w:pStyle w:val="FirstParagraph"/>
-      </w:pPr>
-      <w:r>
-        <w:t xml:space="preserve">The rendered output will be in the</w:t>
-      </w:r>
-      <w:r>
-        <w:t xml:space="preserve"> </w:t>
-      </w:r>
-      <w:r>
-        <w:rPr>
-          <w:rStyle w:val="VerbatimChar"/>
-        </w:rPr>
-        <w:t xml:space="preserve">_site/</w:t>
-      </w:r>
-      <w:r>
-        <w:t xml:space="preserve"> </w:t>
-      </w:r>
-      <w:r>
-        <w:t xml:space="preserve">directory, which can be published to GitHub Pages.</w:t>
+        <w:t xml:space="preserve">@id</w:t>
+      </w:r>
+      <w:r>
+        <w:t xml:space="preserve"> </w:t>
+      </w:r>
+      <w:r>
+        <w:t xml:space="preserve">cross-references only within one rendered page,</w:t>
+      </w:r>
+      <w:r>
+        <w:t xml:space="preserve"> </w:t>
+      </w:r>
+      <w:r>
+        <w:t xml:space="preserve">so a host site that links to a result here</w:t>
+      </w:r>
+      <w:r>
+        <w:t xml:space="preserve"> </w:t>
+      </w:r>
+      <w:r>
+        <w:t xml:space="preserve">uses an explicit link to the page and anchor.</w:t>
       </w:r>
     </w:p>
     <w:bookmarkEnd w:id="12"/>
-    <w:bookmarkStart w:id="13" w:name="publishing-to-github-pages"/>
-    <w:p>
-      <w:pPr>
-        <w:pStyle w:val="Heading2"/>
-      </w:pPr>
-      <w:r>
-        <w:t xml:space="preserve">0.4 Publishing to GitHub Pages</w:t>
-      </w:r>
-    </w:p>
-    <w:p>
-      <w:pPr>
-        <w:pStyle w:val="FirstParagraph"/>
-      </w:pPr>
-      <w:r>
-        <w:t xml:space="preserve">This template includes a GitHub Actions workflow that automatically builds and publishes your website to GitHub Pages when you push to the main branch.</w:t>
-      </w:r>
-    </w:p>
-    <w:p>
-      <w:pPr>
-        <w:pStyle w:val="BodyText"/>
-      </w:pPr>
-      <w:r>
-        <w:t xml:space="preserve">To enable GitHub Pages:</w:t>
-      </w:r>
-    </w:p>
-    <w:p>
-      <w:pPr>
-        <w:pStyle w:val="Compact"/>
-        <w:numPr>
-          <w:ilvl w:val="0"/>
-          <w:numId w:val="1003"/>
-        </w:numPr>
-      </w:pPr>
-      <w:r>
-        <w:t xml:space="preserve">Go to your repository settings</w:t>
-      </w:r>
-    </w:p>
-    <w:p>
-      <w:pPr>
-        <w:pStyle w:val="Compact"/>
-        <w:numPr>
-          <w:ilvl w:val="0"/>
-          <w:numId w:val="1003"/>
-        </w:numPr>
-      </w:pPr>
-      <w:r>
-        <w:t xml:space="preserve">Navigate to</w:t>
-      </w:r>
-      <w:r>
-        <w:t xml:space="preserve"> </w:t>
-      </w:r>
-      <w:r>
-        <w:t xml:space="preserve">“Pages”</w:t>
-      </w:r>
-      <w:r>
-        <w:t xml:space="preserve"> </w:t>
-      </w:r>
-      <w:r>
-        <w:t xml:space="preserve">in the left sidebar</w:t>
-      </w:r>
-    </w:p>
-    <w:p>
-      <w:pPr>
-        <w:pStyle w:val="Compact"/>
-        <w:numPr>
-          <w:ilvl w:val="0"/>
-          <w:numId w:val="1003"/>
-        </w:numPr>
-      </w:pPr>
-      <w:r>
-        <w:t xml:space="preserve">Under</w:t>
-      </w:r>
-      <w:r>
-        <w:t xml:space="preserve"> </w:t>
-      </w:r>
-      <w:r>
-        <w:t xml:space="preserve">“Build and deployment”</w:t>
-      </w:r>
-      <w:r>
-        <w:t xml:space="preserve">, set Source to</w:t>
-      </w:r>
-      <w:r>
-        <w:t xml:space="preserve"> </w:t>
-      </w:r>
-      <w:r>
-        <w:t xml:space="preserve">“GitHub Actions”</w:t>
-      </w:r>
-    </w:p>
-    <w:p>
-      <w:pPr>
-        <w:pStyle w:val="Compact"/>
-        <w:numPr>
-          <w:ilvl w:val="0"/>
-          <w:numId w:val="1003"/>
-        </w:numPr>
-      </w:pPr>
-      <w:r>
-        <w:t xml:space="preserve">Push your changes to the main branch</w:t>
-      </w:r>
-    </w:p>
-    <w:p>
-      <w:pPr>
-        <w:pStyle w:val="Compact"/>
-        <w:numPr>
-          <w:ilvl w:val="0"/>
-          <w:numId w:val="1003"/>
-        </w:numPr>
-      </w:pPr>
-      <w:r>
-        <w:t xml:space="preserve">The workflow will automatically build and deploy your website</w:t>
-      </w:r>
-    </w:p>
-    <w:p>
-      <w:pPr>
-        <w:pStyle w:val="FirstParagraph"/>
-      </w:pPr>
-      <w:r>
-        <w:t xml:space="preserve">Your website will be available at</w:t>
-      </w:r>
-      <w:r>
-        <w:t xml:space="preserve"> </w:t>
-      </w:r>
-      <w:r>
-        <w:rPr>
-          <w:rStyle w:val="VerbatimChar"/>
-        </w:rPr>
-        <w:t xml:space="preserve">https://YOUR-USERNAME.github.io/YOUR-REPO/</w:t>
-      </w:r>
-    </w:p>
-    <w:bookmarkEnd w:id="13"/>
-    <w:bookmarkStart w:id="14" w:name="license"/>
-    <w:p>
-      <w:pPr>
-        <w:pStyle w:val="Heading2"/>
-      </w:pPr>
-      <w:r>
-        <w:t xml:space="preserve">0.5 License</w:t>
-      </w:r>
-    </w:p>
-    <w:p>
-      <w:pPr>
-        <w:pStyle w:val="FirstParagraph"/>
-      </w:pPr>
-      <w:r>
-        <w:t xml:space="preserve">Add your license information here.</w:t>
-      </w:r>
-    </w:p>
-    <w:bookmarkEnd w:id="14"/>
-    <w:bookmarkStart w:id="16" w:name="references"/>
-    <w:p>
-      <w:pPr>
-        <w:pStyle w:val="Heading2"/>
-      </w:pPr>
-      <w:r>
-        <w:t xml:space="preserve">References</w:t>
-      </w:r>
-    </w:p>
-    <w:bookmarkStart w:id="15" w:name="refs"/>
-    <w:bookmarkEnd w:id="15"/>
-    <w:bookmarkEnd w:id="16"/>
-    <w:bookmarkEnd w:id="17"/>
     <w:sectPr>
       <w:footnotePr>
         <w:numRestart w:val="eachSect"/>
@@ -818,156 +539,11 @@
       </w:rPr>
     </w:lvl>
   </w:abstractNum>
-  <w:abstractNum w:abstractNumId="99411">
-    <w:nsid w:val="00A99411"/>
-    <w:multiLevelType w:val="multilevel"/>
-    <w:lvl w:ilvl="0">
-      <w:start w:val="1"/>
-      <w:numFmt w:val="decimal"/>
-      <w:lvlText w:val="%1."/>
-      <w:lvlJc w:val="left"/>
-      <w:pPr>
-        <w:ind w:left="720" w:hanging="360"/>
-      </w:pPr>
-    </w:lvl>
-    <w:lvl w:ilvl="1">
-      <w:start w:val="1"/>
-      <w:numFmt w:val="decimal"/>
-      <w:lvlText w:val="%2."/>
-      <w:lvlJc w:val="left"/>
-      <w:pPr>
-        <w:ind w:left="1440" w:hanging="360"/>
-      </w:pPr>
-    </w:lvl>
-    <w:lvl w:ilvl="2">
-      <w:start w:val="1"/>
-      <w:numFmt w:val="decimal"/>
-      <w:lvlText w:val="%3."/>
-      <w:lvlJc w:val="left"/>
-      <w:pPr>
-        <w:ind w:left="2160" w:hanging="360"/>
-      </w:pPr>
-    </w:lvl>
-    <w:lvl w:ilvl="3">
-      <w:start w:val="1"/>
-      <w:numFmt w:val="decimal"/>
-      <w:lvlText w:val="%4."/>
-      <w:lvlJc w:val="left"/>
-      <w:pPr>
-        <w:ind w:left="2880" w:hanging="360"/>
-      </w:pPr>
-    </w:lvl>
-    <w:lvl w:ilvl="4">
-      <w:start w:val="1"/>
-      <w:numFmt w:val="decimal"/>
-      <w:lvlText w:val="%5."/>
-      <w:lvlJc w:val="left"/>
-      <w:pPr>
-        <w:ind w:left="3600" w:hanging="360"/>
-      </w:pPr>
-    </w:lvl>
-    <w:lvl w:ilvl="5">
-      <w:start w:val="1"/>
-      <w:numFmt w:val="decimal"/>
-      <w:lvlText w:val="%6."/>
-      <w:lvlJc w:val="left"/>
-      <w:pPr>
-        <w:ind w:left="4320" w:hanging="360"/>
-      </w:pPr>
-    </w:lvl>
-    <w:lvl w:ilvl="6">
-      <w:start w:val="1"/>
-      <w:numFmt w:val="decimal"/>
-      <w:lvlText w:val="%7."/>
-      <w:lvlJc w:val="left"/>
-      <w:pPr>
-        <w:ind w:left="5040" w:hanging="360"/>
-      </w:pPr>
-    </w:lvl>
-    <w:lvl w:ilvl="7">
-      <w:start w:val="1"/>
-      <w:numFmt w:val="decimal"/>
-      <w:lvlText w:val="%8."/>
-      <w:lvlJc w:val="left"/>
-      <w:pPr>
-        <w:ind w:left="5760" w:hanging="360"/>
-      </w:pPr>
-    </w:lvl>
-    <w:lvl w:ilvl="8">
-      <w:start w:val="1"/>
-      <w:numFmt w:val="decimal"/>
-      <w:lvlText w:val="%9."/>
-      <w:lvlJc w:val="left"/>
-      <w:pPr>
-        <w:ind w:left="6480" w:hanging="360"/>
-      </w:pPr>
-    </w:lvl>
-  </w:abstractNum>
   <w:num w:numId="1000">
     <w:abstractNumId w:val="990"/>
   </w:num>
   <w:num w:numId="1001">
     <w:abstractNumId w:val="991"/>
-  </w:num>
-  <w:num w:numId="1002">
-    <w:abstractNumId w:val="99411"/>
-    <w:lvlOverride w:ilvl="0">
-      <w:startOverride w:val="1"/>
-    </w:lvlOverride>
-    <w:lvlOverride w:ilvl="1">
-      <w:startOverride w:val="1"/>
-    </w:lvlOverride>
-    <w:lvlOverride w:ilvl="2">
-      <w:startOverride w:val="1"/>
-    </w:lvlOverride>
-    <w:lvlOverride w:ilvl="3">
-      <w:startOverride w:val="1"/>
-    </w:lvlOverride>
-    <w:lvlOverride w:ilvl="4">
-      <w:startOverride w:val="1"/>
-    </w:lvlOverride>
-    <w:lvlOverride w:ilvl="5">
-      <w:startOverride w:val="1"/>
-    </w:lvlOverride>
-    <w:lvlOverride w:ilvl="6">
-      <w:startOverride w:val="1"/>
-    </w:lvlOverride>
-    <w:lvlOverride w:ilvl="7">
-      <w:startOverride w:val="1"/>
-    </w:lvlOverride>
-    <w:lvlOverride w:ilvl="8">
-      <w:startOverride w:val="1"/>
-    </w:lvlOverride>
-  </w:num>
-  <w:num w:numId="1003">
-    <w:abstractNumId w:val="99411"/>
-    <w:lvlOverride w:ilvl="0">
-      <w:startOverride w:val="1"/>
-    </w:lvlOverride>
-    <w:lvlOverride w:ilvl="1">
-      <w:startOverride w:val="1"/>
-    </w:lvlOverride>
-    <w:lvlOverride w:ilvl="2">
-      <w:startOverride w:val="1"/>
-    </w:lvlOverride>
-    <w:lvlOverride w:ilvl="3">
-      <w:startOverride w:val="1"/>
-    </w:lvlOverride>
-    <w:lvlOverride w:ilvl="4">
-      <w:startOverride w:val="1"/>
-    </w:lvlOverride>
-    <w:lvlOverride w:ilvl="5">
-      <w:startOverride w:val="1"/>
-    </w:lvlOverride>
-    <w:lvlOverride w:ilvl="6">
-      <w:startOverride w:val="1"/>
-    </w:lvlOverride>
-    <w:lvlOverride w:ilvl="7">
-      <w:startOverride w:val="1"/>
-    </w:lvlOverride>
-    <w:lvlOverride w:ilvl="8">
-      <w:startOverride w:val="1"/>
-    </w:lvlOverride>
   </w:num>
 </w:numbering>
 </file>

</xml_diff>

<commit_message>
Deploying to gh-pages from @ Morrison-Lab/ids@0334f79ba22340fc68fa911b39324395eb11399b 🚀
</commit_message>
<xml_diff>
--- a/index.docx
+++ b/index.docx
@@ -15,10 +15,10 @@
         <w:pStyle w:val="Date"/>
       </w:pPr>
       <w:r>
-        <w:t xml:space="preserve">Last modified: 2026-10-12 01:05:26 (PDT)</w:t>
+        <w:t xml:space="preserve">Last modified: 2026-10-12 02:31:20 (PDT)</w:t>
       </w:r>
     </w:p>
-    <w:bookmarkStart w:id="11" w:name="welcome"/>
+    <w:bookmarkStart w:id="13" w:name="welcome"/>
     <w:p>
       <w:pPr>
         <w:pStyle w:val="Heading2"/>
@@ -82,13 +82,13 @@
         <w:t xml:space="preserve"> </w:t>
       </w:r>
       <w:r>
-        <w:t xml:space="preserve">They are new, and the topic pages are still to be written.</w:t>
-      </w:r>
-      <w:r>
-        <w:t xml:space="preserve"> </w:t>
-      </w:r>
-      <w:r>
-        <w:t xml:space="preserve">The planned topics are:</w:t>
+        <w:t xml:space="preserve">They are new.</w:t>
+      </w:r>
+      <w:r>
+        <w:t xml:space="preserve"> </w:t>
+      </w:r>
+      <w:r>
+        <w:t xml:space="preserve">The pages written so far are:</w:t>
       </w:r>
     </w:p>
     <w:p>
@@ -99,8 +99,28 @@
           <w:numId w:val="1001"/>
         </w:numPr>
       </w:pPr>
-      <w:r>
-        <w:t xml:space="preserve">entropy, joint and conditional entropy, and mutual information</w:t>
+      <w:hyperlink r:id="rId9">
+        <w:r>
+          <w:rPr>
+            <w:rStyle w:val="Hyperlink"/>
+          </w:rPr>
+          <w:t xml:space="preserve">Entropy and mutual information</w:t>
+        </w:r>
+      </w:hyperlink>
+      <w:r>
+        <w:t xml:space="preserve">:</w:t>
+      </w:r>
+      <w:r>
+        <w:t xml:space="preserve"> </w:t>
+      </w:r>
+      <w:r>
+        <w:t xml:space="preserve">surprisal, joint and conditional entropy, mutual information,</w:t>
+      </w:r>
+      <w:r>
+        <w:t xml:space="preserve"> </w:t>
+      </w:r>
+      <w:r>
+        <w:t xml:space="preserve">and the information gain of decision trees</w:t>
       </w:r>
     </w:p>
     <w:p>
@@ -111,8 +131,36 @@
           <w:numId w:val="1001"/>
         </w:numPr>
       </w:pPr>
-      <w:r>
-        <w:t xml:space="preserve">Kullback–Leibler divergence and its link to maximum likelihood</w:t>
+      <w:hyperlink r:id="rId10">
+        <w:r>
+          <w:rPr>
+            <w:rStyle w:val="Hyperlink"/>
+          </w:rPr>
+          <w:t xml:space="preserve">Source coding</w:t>
+        </w:r>
+      </w:hyperlink>
+      <w:r>
+        <w:t xml:space="preserve">:</w:t>
+      </w:r>
+      <w:r>
+        <w:t xml:space="preserve"> </w:t>
+      </w:r>
+      <w:r>
+        <w:t xml:space="preserve">the source coding theorem, and cross-entropy as the cost of coding</w:t>
+      </w:r>
+      <w:r>
+        <w:t xml:space="preserve"> </w:t>
+      </w:r>
+      <w:r>
+        <w:t xml:space="preserve">with the wrong distribution</w:t>
+      </w:r>
+    </w:p>
+    <w:p>
+      <w:pPr>
+        <w:pStyle w:val="FirstParagraph"/>
+      </w:pPr>
+      <w:r>
+        <w:t xml:space="preserve">The planned topics still to come are:</w:t>
       </w:r>
     </w:p>
     <w:p>
@@ -120,11 +168,11 @@
         <w:pStyle w:val="Compact"/>
         <w:numPr>
           <w:ilvl w:val="0"/>
-          <w:numId w:val="1001"/>
+          <w:numId w:val="1002"/>
         </w:numPr>
       </w:pPr>
       <w:r>
-        <w:t xml:space="preserve">source coding: the source coding theorem, Huffman and arithmetic codes</w:t>
+        <w:t xml:space="preserve">Kullback–Leibler divergence and its link to maximum likelihood</w:t>
       </w:r>
     </w:p>
     <w:p>
@@ -132,11 +180,11 @@
         <w:pStyle w:val="Compact"/>
         <w:numPr>
           <w:ilvl w:val="0"/>
-          <w:numId w:val="1001"/>
+          <w:numId w:val="1002"/>
         </w:numPr>
       </w:pPr>
       <w:r>
-        <w:t xml:space="preserve">channel coding: channel capacity and the noisy-channel coding theorem</w:t>
+        <w:t xml:space="preserve">Huffman and arithmetic codes</w:t>
       </w:r>
     </w:p>
     <w:p>
@@ -144,15 +192,27 @@
         <w:pStyle w:val="Compact"/>
         <w:numPr>
           <w:ilvl w:val="0"/>
-          <w:numId w:val="1001"/>
+          <w:numId w:val="1002"/>
         </w:numPr>
       </w:pPr>
       <w:r>
-        <w:t xml:space="preserve">Kolmogorov complexity, and how it relates to Shannon entropy</w:t>
+        <w:t xml:space="preserve">channel coding: channel capacity and the noisy-channel coding theorem</w:t>
       </w:r>
     </w:p>
     <w:p>
       <w:pPr>
+        <w:pStyle w:val="Compact"/>
+        <w:numPr>
+          <w:ilvl w:val="0"/>
+          <w:numId w:val="1002"/>
+        </w:numPr>
+      </w:pPr>
+      <w:r>
+        <w:t xml:space="preserve">Kolmogorov complexity, and how it relates to Shannon entropy</w:t>
+      </w:r>
+    </w:p>
+    <w:p>
+      <w:pPr>
         <w:pStyle w:val="FirstParagraph"/>
       </w:pPr>
       <w:r>
@@ -161,7 +221,7 @@
       <w:r>
         <w:t xml:space="preserve"> </w:t>
       </w:r>
-      <w:hyperlink r:id="rId9">
+      <w:hyperlink r:id="rId11">
         <w:r>
           <w:rPr>
             <w:rStyle w:val="Hyperlink"/>
@@ -189,7 +249,7 @@
       <w:r>
         <w:t xml:space="preserve"> </w:t>
       </w:r>
-      <w:hyperlink r:id="rId10">
+      <w:hyperlink r:id="rId12">
         <w:r>
           <w:rPr>
             <w:rStyle w:val="Hyperlink"/>
@@ -203,8 +263,8 @@
         <w:t xml:space="preserve">.</w:t>
       </w:r>
     </w:p>
-    <w:bookmarkEnd w:id="11"/>
-    <w:bookmarkStart w:id="12" w:name="using-these-notes-in-another-site"/>
+    <w:bookmarkEnd w:id="13"/>
+    <w:bookmarkStart w:id="14" w:name="using-these-notes-in-another-site"/>
     <w:p>
       <w:pPr>
         <w:pStyle w:val="Heading2"/>
@@ -325,7 +385,7 @@
         <w:t xml:space="preserve">uses an explicit link to the page and anchor.</w:t>
       </w:r>
     </w:p>
-    <w:bookmarkEnd w:id="12"/>
+    <w:bookmarkEnd w:id="14"/>
     <w:sectPr>
       <w:footnotePr>
         <w:numRestart w:val="eachSect"/>
@@ -543,6 +603,9 @@
     <w:abstractNumId w:val="990"/>
   </w:num>
   <w:num w:numId="1001">
+    <w:abstractNumId w:val="991"/>
+  </w:num>
+  <w:num w:numId="1002">
     <w:abstractNumId w:val="991"/>
   </w:num>
 </w:numbering>

</xml_diff>

<commit_message>
Deploying to gh-pages from @ Morrison-Lab/ids@547f1aa2ca8a99f56e76e86feb18b9d668eb1cf1 🚀
</commit_message>
<xml_diff>
--- a/index.docx
+++ b/index.docx
@@ -15,7 +15,7 @@
         <w:pStyle w:val="Date"/>
       </w:pPr>
       <w:r>
-        <w:t xml:space="preserve">Last modified: 2026-10-12 02:31:20 (PDT)</w:t>
+        <w:t xml:space="preserve">Last modified: 2026-10-13 14:27:11 (PDT)</w:t>
       </w:r>
     </w:p>
     <w:bookmarkStart w:id="13" w:name="welcome"/>
@@ -264,7 +264,160 @@
       </w:r>
     </w:p>
     <w:bookmarkEnd w:id="13"/>
-    <w:bookmarkStart w:id="14" w:name="using-these-notes-in-another-site"/>
+    <w:bookmarkStart w:id="17" w:name="where-to-read-about-the-planned-topics"/>
+    <w:p>
+      <w:pPr>
+        <w:pStyle w:val="Heading2"/>
+      </w:pPr>
+      <w:r>
+        <w:t xml:space="preserve">Where to read about the planned topics</w:t>
+      </w:r>
+    </w:p>
+    <w:p>
+      <w:pPr>
+        <w:pStyle w:val="FirstParagraph"/>
+      </w:pPr>
+      <w:r>
+        <w:t xml:space="preserve">Stanford’s information theory courses cover many of the planned topics above,</w:t>
+      </w:r>
+      <w:r>
+        <w:t xml:space="preserve"> </w:t>
+      </w:r>
+      <w:r>
+        <w:t xml:space="preserve">and they publish their course pages:</w:t>
+      </w:r>
+    </w:p>
+    <w:p>
+      <w:pPr>
+        <w:pStyle w:val="Compact"/>
+        <w:numPr>
+          <w:ilvl w:val="0"/>
+          <w:numId w:val="1003"/>
+        </w:numPr>
+      </w:pPr>
+      <w:hyperlink r:id="rId14">
+        <w:r>
+          <w:rPr>
+            <w:rStyle w:val="Hyperlink"/>
+          </w:rPr>
+          <w:t xml:space="preserve">EE 276,</w:t>
+        </w:r>
+        <w:r>
+          <w:rPr>
+            <w:rStyle w:val="Hyperlink"/>
+          </w:rPr>
+          <w:t xml:space="preserve"> </w:t>
+        </w:r>
+        <w:r>
+          <w:rPr>
+            <w:rStyle w:val="Hyperlink"/>
+            <w:i/>
+            <w:iCs/>
+          </w:rPr>
+          <w:t xml:space="preserve">Information Theory</w:t>
+        </w:r>
+      </w:hyperlink>
+      <w:r>
+        <w:t xml:space="preserve"> </w:t>
+      </w:r>
+      <w:r>
+        <w:t xml:space="preserve">(Tsachy Weissman) covers entropy and mutual information,</w:t>
+      </w:r>
+      <w:r>
+        <w:t xml:space="preserve"> </w:t>
+      </w:r>
+      <w:r>
+        <w:t xml:space="preserve">the asymptotic equipartition property, prefix codes and Huffman codes,</w:t>
+      </w:r>
+      <w:r>
+        <w:t xml:space="preserve"> </w:t>
+      </w:r>
+      <w:r>
+        <w:t xml:space="preserve">channel capacity and the channel coding theorem, and rate distortion.</w:t>
+      </w:r>
+      <w:r>
+        <w:t xml:space="preserve"> </w:t>
+      </w:r>
+      <w:r>
+        <w:t xml:space="preserve">Its</w:t>
+      </w:r>
+      <w:r>
+        <w:t xml:space="preserve"> </w:t>
+      </w:r>
+      <w:hyperlink r:id="rId15">
+        <w:r>
+          <w:rPr>
+            <w:rStyle w:val="Hyperlink"/>
+          </w:rPr>
+          <w:t xml:space="preserve">reading page</w:t>
+        </w:r>
+      </w:hyperlink>
+      <w:r>
+        <w:t xml:space="preserve"> </w:t>
+      </w:r>
+      <w:r>
+        <w:t xml:space="preserve">lists books and Shannon’s papers.</w:t>
+      </w:r>
+    </w:p>
+    <w:p>
+      <w:pPr>
+        <w:pStyle w:val="Compact"/>
+        <w:numPr>
+          <w:ilvl w:val="0"/>
+          <w:numId w:val="1003"/>
+        </w:numPr>
+      </w:pPr>
+      <w:hyperlink r:id="rId16">
+        <w:r>
+          <w:rPr>
+            <w:rStyle w:val="Hyperlink"/>
+          </w:rPr>
+          <w:t xml:space="preserve">EE 274,</w:t>
+        </w:r>
+        <w:r>
+          <w:rPr>
+            <w:rStyle w:val="Hyperlink"/>
+          </w:rPr>
+          <w:t xml:space="preserve"> </w:t>
+        </w:r>
+        <w:r>
+          <w:rPr>
+            <w:rStyle w:val="Hyperlink"/>
+            <w:i/>
+            <w:iCs/>
+          </w:rPr>
+          <w:t xml:space="preserve">Data Compression, Theory and Applications</w:t>
+        </w:r>
+      </w:hyperlink>
+      <w:r>
+        <w:t xml:space="preserve"> </w:t>
+      </w:r>
+      <w:r>
+        <w:t xml:space="preserve">covers entropy coding and how tools such as gzip and bzip2 work,</w:t>
+      </w:r>
+      <w:r>
+        <w:t xml:space="preserve"> </w:t>
+      </w:r>
+      <w:r>
+        <w:t xml:space="preserve">then lossy image and video coding.</w:t>
+      </w:r>
+    </w:p>
+    <w:p>
+      <w:pPr>
+        <w:pStyle w:val="FirstParagraph"/>
+      </w:pPr>
+      <w:r>
+        <w:t xml:space="preserve">The courses’ own notes and slides carry no license,</w:t>
+      </w:r>
+      <w:r>
+        <w:t xml:space="preserve"> </w:t>
+      </w:r>
+      <w:r>
+        <w:t xml:space="preserve">so these notes link to them and do not reuse their text.</w:t>
+      </w:r>
+    </w:p>
+    <w:bookmarkEnd w:id="17"/>
+    <w:bookmarkStart w:id="18" w:name="using-these-notes-in-another-site"/>
     <w:p>
       <w:pPr>
         <w:pStyle w:val="Heading2"/>
@@ -385,7 +538,7 @@
         <w:t xml:space="preserve">uses an explicit link to the page and anchor.</w:t>
       </w:r>
     </w:p>
-    <w:bookmarkEnd w:id="14"/>
+    <w:bookmarkEnd w:id="18"/>
     <w:sectPr>
       <w:footnotePr>
         <w:numRestart w:val="eachSect"/>
@@ -606,6 +759,9 @@
     <w:abstractNumId w:val="991"/>
   </w:num>
   <w:num w:numId="1002">
+    <w:abstractNumId w:val="991"/>
+  </w:num>
+  <w:num w:numId="1003">
     <w:abstractNumId w:val="991"/>
   </w:num>
 </w:numbering>

</xml_diff>

<commit_message>
Deploying to gh-pages from @ Morrison-Lab/ids@4280d26fd786a16356214bb79fc95a15b929c48d 🚀
</commit_message>
<xml_diff>
--- a/index.docx
+++ b/index.docx
@@ -15,10 +15,10 @@
         <w:pStyle w:val="Date"/>
       </w:pPr>
       <w:r>
-        <w:t xml:space="preserve">Last modified: 2026-10-14 01:49:15 (PDT)</w:t>
-      </w:r>
-    </w:p>
-    <w:bookmarkStart w:id="13" w:name="welcome"/>
+        <w:t xml:space="preserve">Last modified: 2026-10-14 11:35:38 (PDT)</w:t>
+      </w:r>
+    </w:p>
+    <w:bookmarkStart w:id="14" w:name="welcome"/>
     <w:p>
       <w:pPr>
         <w:pStyle w:val="Heading2"/>
@@ -157,6 +157,44 @@
     </w:p>
     <w:p>
       <w:pPr>
+        <w:pStyle w:val="Compact"/>
+        <w:numPr>
+          <w:ilvl w:val="0"/>
+          <w:numId w:val="1001"/>
+        </w:numPr>
+      </w:pPr>
+      <w:hyperlink r:id="rId11">
+        <w:r>
+          <w:rPr>
+            <w:rStyle w:val="Hyperlink"/>
+          </w:rPr>
+          <w:t xml:space="preserve">Error-correcting codes</w:t>
+        </w:r>
+      </w:hyperlink>
+      <w:r>
+        <w:t xml:space="preserve">:</w:t>
+      </w:r>
+      <w:r>
+        <w:t xml:space="preserve"> </w:t>
+      </w:r>
+      <w:r>
+        <w:t xml:space="preserve">Hamming distance, the Hamming and Reed–Solomon codes,</w:t>
+      </w:r>
+      <w:r>
+        <w:t xml:space="preserve"> </w:t>
+      </w:r>
+      <w:r>
+        <w:t xml:space="preserve">and how locally decodable codes lead to hardness amplification</w:t>
+      </w:r>
+      <w:r>
+        <w:t xml:space="preserve"> </w:t>
+      </w:r>
+      <w:r>
+        <w:t xml:space="preserve">and the PCP theorem</w:t>
+      </w:r>
+    </w:p>
+    <w:p>
+      <w:pPr>
         <w:pStyle w:val="FirstParagraph"/>
       </w:pPr>
       <w:r>
@@ -201,18 +239,6 @@
     </w:p>
     <w:p>
       <w:pPr>
-        <w:pStyle w:val="Compact"/>
-        <w:numPr>
-          <w:ilvl w:val="0"/>
-          <w:numId w:val="1002"/>
-        </w:numPr>
-      </w:pPr>
-      <w:r>
-        <w:t xml:space="preserve">Kolmogorov complexity, and how it relates to Shannon entropy</w:t>
-      </w:r>
-    </w:p>
-    <w:p>
-      <w:pPr>
         <w:pStyle w:val="FirstParagraph"/>
       </w:pPr>
       <w:r>
@@ -221,7 +247,7 @@
       <w:r>
         <w:t xml:space="preserve"> </w:t>
       </w:r>
-      <w:hyperlink r:id="rId11">
+      <w:hyperlink r:id="rId12">
         <w:r>
           <w:rPr>
             <w:rStyle w:val="Hyperlink"/>
@@ -249,7 +275,7 @@
       <w:r>
         <w:t xml:space="preserve"> </w:t>
       </w:r>
-      <w:hyperlink r:id="rId12">
+      <w:hyperlink r:id="rId13">
         <w:r>
           <w:rPr>
             <w:rStyle w:val="Hyperlink"/>
@@ -262,9 +288,21 @@
       <w:r>
         <w:t xml:space="preserve">.</w:t>
       </w:r>
-    </w:p>
-    <w:bookmarkEnd w:id="13"/>
-    <w:bookmarkStart w:id="17" w:name="where-to-read-about-the-planned-topics"/>
+      <w:r>
+        <w:t xml:space="preserve"> </w:t>
+      </w:r>
+      <w:r>
+        <w:t xml:space="preserve">Kolmogorov complexity, which relates the shortest description of a single string</w:t>
+      </w:r>
+      <w:r>
+        <w:t xml:space="preserve"> </w:t>
+      </w:r>
+      <w:r>
+        <w:t xml:space="preserve">to Shannon entropy, is covered there.</w:t>
+      </w:r>
+    </w:p>
+    <w:bookmarkEnd w:id="14"/>
+    <w:bookmarkStart w:id="18" w:name="where-to-read-about-the-planned-topics"/>
     <w:p>
       <w:pPr>
         <w:pStyle w:val="Heading2"/>
@@ -295,7 +333,7 @@
           <w:numId w:val="1003"/>
         </w:numPr>
       </w:pPr>
-      <w:hyperlink r:id="rId14">
+      <w:hyperlink r:id="rId15">
         <w:r>
           <w:rPr>
             <w:rStyle w:val="Hyperlink"/>
@@ -344,7 +382,7 @@
       <w:r>
         <w:t xml:space="preserve"> </w:t>
       </w:r>
-      <w:hyperlink r:id="rId15">
+      <w:hyperlink r:id="rId16">
         <w:r>
           <w:rPr>
             <w:rStyle w:val="Hyperlink"/>
@@ -367,7 +405,7 @@
           <w:numId w:val="1003"/>
         </w:numPr>
       </w:pPr>
-      <w:hyperlink r:id="rId16">
+      <w:hyperlink r:id="rId17">
         <w:r>
           <w:rPr>
             <w:rStyle w:val="Hyperlink"/>
@@ -416,8 +454,8 @@
         <w:t xml:space="preserve">so these notes link to them and do not reuse their text.</w:t>
       </w:r>
     </w:p>
-    <w:bookmarkEnd w:id="17"/>
-    <w:bookmarkStart w:id="18" w:name="using-these-notes-in-another-site"/>
+    <w:bookmarkEnd w:id="18"/>
+    <w:bookmarkStart w:id="19" w:name="using-these-notes-in-another-site"/>
     <w:p>
       <w:pPr>
         <w:pStyle w:val="Heading2"/>
@@ -538,7 +576,7 @@
         <w:t xml:space="preserve">uses an explicit link to the page and anchor.</w:t>
       </w:r>
     </w:p>
-    <w:bookmarkEnd w:id="18"/>
+    <w:bookmarkEnd w:id="19"/>
     <w:sectPr>
       <w:footnotePr>
         <w:numRestart w:val="eachSect"/>

</xml_diff>

<commit_message>
Deploying to gh-pages from @ Morrison-Lab/ids@6c755de2c6b7dfab10f1774b727988e761db91ca 🚀
</commit_message>
<xml_diff>
--- a/index.docx
+++ b/index.docx
@@ -15,10 +15,10 @@
         <w:pStyle w:val="Date"/>
       </w:pPr>
       <w:r>
-        <w:t xml:space="preserve">Last modified: 2026-10-14 11:35:38 (PDT)</w:t>
-      </w:r>
-    </w:p>
-    <w:bookmarkStart w:id="14" w:name="welcome"/>
+        <w:t xml:space="preserve">Last modified: 2026-10-14 11:45:26 (PDT)</w:t>
+      </w:r>
+    </w:p>
+    <w:bookmarkStart w:id="15" w:name="welcome"/>
     <w:p>
       <w:pPr>
         <w:pStyle w:val="Heading2"/>
@@ -168,6 +168,38 @@
           <w:rPr>
             <w:rStyle w:val="Hyperlink"/>
           </w:rPr>
+          <w:t xml:space="preserve">Channel capacity</w:t>
+        </w:r>
+      </w:hyperlink>
+      <w:r>
+        <w:t xml:space="preserve">:</w:t>
+      </w:r>
+      <w:r>
+        <w:t xml:space="preserve"> </w:t>
+      </w:r>
+      <w:r>
+        <w:t xml:space="preserve">discrete memoryless channels, the capacity of the binary symmetric</w:t>
+      </w:r>
+      <w:r>
+        <w:t xml:space="preserve"> </w:t>
+      </w:r>
+      <w:r>
+        <w:t xml:space="preserve">and erasure channels, and the noisy-channel coding theorem</w:t>
+      </w:r>
+    </w:p>
+    <w:p>
+      <w:pPr>
+        <w:pStyle w:val="Compact"/>
+        <w:numPr>
+          <w:ilvl w:val="0"/>
+          <w:numId w:val="1001"/>
+        </w:numPr>
+      </w:pPr>
+      <w:hyperlink r:id="rId12">
+        <w:r>
+          <w:rPr>
+            <w:rStyle w:val="Hyperlink"/>
+          </w:rPr>
           <w:t xml:space="preserve">Error-correcting codes</w:t>
         </w:r>
       </w:hyperlink>
@@ -234,7 +266,7 @@
         </w:numPr>
       </w:pPr>
       <w:r>
-        <w:t xml:space="preserve">channel coding: channel capacity and the noisy-channel coding theorem</w:t>
+        <w:t xml:space="preserve">proofs of the noisy-channel coding theorem, and codes that approach capacity</w:t>
       </w:r>
     </w:p>
     <w:p>
@@ -247,7 +279,7 @@
       <w:r>
         <w:t xml:space="preserve"> </w:t>
       </w:r>
-      <w:hyperlink r:id="rId12">
+      <w:hyperlink r:id="rId13">
         <w:r>
           <w:rPr>
             <w:rStyle w:val="Hyperlink"/>
@@ -275,7 +307,7 @@
       <w:r>
         <w:t xml:space="preserve"> </w:t>
       </w:r>
-      <w:hyperlink r:id="rId13">
+      <w:hyperlink r:id="rId14">
         <w:r>
           <w:rPr>
             <w:rStyle w:val="Hyperlink"/>
@@ -301,8 +333,8 @@
         <w:t xml:space="preserve">to Shannon entropy, is covered there.</w:t>
       </w:r>
     </w:p>
-    <w:bookmarkEnd w:id="14"/>
-    <w:bookmarkStart w:id="18" w:name="where-to-read-about-the-planned-topics"/>
+    <w:bookmarkEnd w:id="15"/>
+    <w:bookmarkStart w:id="19" w:name="where-to-read-about-the-planned-topics"/>
     <w:p>
       <w:pPr>
         <w:pStyle w:val="Heading2"/>
@@ -333,7 +365,7 @@
           <w:numId w:val="1003"/>
         </w:numPr>
       </w:pPr>
-      <w:hyperlink r:id="rId15">
+      <w:hyperlink r:id="rId16">
         <w:r>
           <w:rPr>
             <w:rStyle w:val="Hyperlink"/>
@@ -382,7 +414,7 @@
       <w:r>
         <w:t xml:space="preserve"> </w:t>
       </w:r>
-      <w:hyperlink r:id="rId16">
+      <w:hyperlink r:id="rId17">
         <w:r>
           <w:rPr>
             <w:rStyle w:val="Hyperlink"/>
@@ -405,7 +437,7 @@
           <w:numId w:val="1003"/>
         </w:numPr>
       </w:pPr>
-      <w:hyperlink r:id="rId17">
+      <w:hyperlink r:id="rId18">
         <w:r>
           <w:rPr>
             <w:rStyle w:val="Hyperlink"/>
@@ -454,8 +486,8 @@
         <w:t xml:space="preserve">so these notes link to them and do not reuse their text.</w:t>
       </w:r>
     </w:p>
-    <w:bookmarkEnd w:id="18"/>
-    <w:bookmarkStart w:id="19" w:name="using-these-notes-in-another-site"/>
+    <w:bookmarkEnd w:id="19"/>
+    <w:bookmarkStart w:id="20" w:name="using-these-notes-in-another-site"/>
     <w:p>
       <w:pPr>
         <w:pStyle w:val="Heading2"/>
@@ -576,7 +608,7 @@
         <w:t xml:space="preserve">uses an explicit link to the page and anchor.</w:t>
       </w:r>
     </w:p>
-    <w:bookmarkEnd w:id="19"/>
+    <w:bookmarkEnd w:id="20"/>
     <w:sectPr>
       <w:footnotePr>
         <w:numRestart w:val="eachSect"/>

</xml_diff>